<commit_message>
container-damage-detection: 论文 patch 分类改为 LightGBM 并修正验证集指标
- 论文 4.3–4.4 节由随机森林改写为 LightGBM（GBDT 数学推导 + 网格搜索），
  更新摘要/第5/6章/汇总表/参考文献（+Ke 2017, Friedman 2001）
- 修正验证集指标为训练一致划分（2703 patch）：Acc=89.72%、Macro F1=0.855、
  BG→Damage 21 例（1.9%），逐类与混淆矩阵数据同步更新
- problem3/evaluate.py 按训练时相同的随机消耗顺序（划分→建训练集→建验证集）
  复现验证集，此前评估结果因随机状态顺序不同而不可复现
- README 移除 RF 早期实验说明，注明 LightGBM 与模型/论文一致

Co-Authored-By: Claude Opus 4.7 <noreply@anthropic.com>
</commit_message>
<xml_diff>
--- a/contests/container-damage-detection/output/论文_集装箱破损检测.docx
+++ b/contests/container-damage-detection/output/论文_集装箱破损检测.docx
@@ -106,7 +106,7 @@
           <w:b w:val="0"/>
           <w:sz w:val="24"/>
         </w:rPr>
-        <w:t>问题2（残损检测与分类）：首先探索了"72维增强特征+Random Forest 多分类+多尺度滑动窗口+NMS"的传统检测管线，patch 级 4 分类达到 85.68% 准确率，但滑动窗口检测因训练-推理分布偏移而陷入根本性瓶颈（Precision/Recall 均低于 15%）。在此基础上，本文转向端到端检测范式，构建了 YOLOv8s 检测模型，并提出了三项针对性改进：（1）以 Wise-IoU v1 距离注意力损失替换 CIoU 边界框损失，通过指数形式的中心距离惩罚 R_WIoU=exp(ρ²/c²) 自适应地增强大目标（锈蚀）的定位精度；（2）以 SlideLoss 滑窗加权损失替换标准 BCE 分类损失，通过基于前景平均对齐分数的单调递减权重函数实现简单/困难样本的软性再平衡；（3）引入 P2 高分辨率检测层（stride=4），将最小可检测目标从 8×8 扩展至 4×4 像素，针对性解决小残损漏检问题。最终模型在验证集上达到 mAP@0.5=0.403、mAP@0.5:0.95=0.199、Precision=0.559、Recall=0.427，其中最难检测的 Rusty 类别 AP@0.5 由 0.222 提升至 0.252（+14%），并已生成符合提交规范的 test_result.csv（413 张测试图、775 个检测框）。</w:t>
+        <w:t>问题2（残损检测与分类）：首先探索了"72维增强特征+LightGBM 多分类+多尺度滑动窗口+NMS"的传统检测管线，patch 级 4 分类达到 89.72% 准确率，但滑动窗口检测因训练-推理分布偏移而陷入根本性瓶颈（Precision/Recall 均低于 15%）。在此基础上，本文转向端到端检测范式，构建了 YOLOv8s 检测模型，并提出了三项针对性改进：（1）以 Wise-IoU v1 距离注意力损失替换 CIoU 边界框损失，通过指数形式的中心距离惩罚 R_WIoU=exp(ρ²/c²) 自适应地增强大目标（锈蚀）的定位精度；（2）以 SlideLoss 滑窗加权损失替换标准 BCE 分类损失，通过基于前景平均对齐分数的单调递减权重函数实现简单/困难样本的软性再平衡；（3）引入 P2 高分辨率检测层（stride=4），将最小可检测目标从 8×8 扩展至 4×4 像素，针对性解决小残损漏检问题。最终模型在验证集上达到 mAP@0.5=0.403、mAP@0.5:0.95=0.199、Precision=0.559、Recall=0.427，其中最难检测的 Rusty 类别 AP@0.5 由 0.222 提升至 0.252（+14%），并已生成符合提交规范的 test_result.csv（413 张测试图、775 个检测框）。</w:t>
       </w:r>
     </w:p>
     <w:p>
@@ -119,7 +119,7 @@
           <w:b w:val="0"/>
           <w:sz w:val="24"/>
         </w:rPr>
-        <w:t>问题3（模型评估）：从分类性能、特征有效性、阈值框架比较、检测精度、逐类性能、消融实验、方法对比、部署可行性等多维度进行了系统评估。核心发现是：（1）手工特征方法在全局判别（问题1 F2=0.9985）和局部区域分类（问题2 patch Acc=85.68%）两个层次均有竞争力，性能退化仅出现在空间定位层次——该瓶颈源于滑动窗口策略本身的方法论缺陷；（2）端到端检测器通过可微分的边界框回归从机制上规避了离散枚举与分布偏移问题，检测性能相对滑动窗口方案提升 4 倍以上（Recall 16%→43%，Precision 11%→56%）；（3）针对任务特点的损失函数与结构改进（Wise-IoU、SlideLoss、P2 层）能够在模型容量不变的前提下带来可观的性能增益，验证了"任务驱动的模型改进"优于"盲目增大模型规模"的建模思想。</w:t>
+        <w:t>问题3（模型评估）：从分类性能、特征有效性、阈值框架比较、检测精度、逐类性能、消融实验、方法对比、部署可行性等多维度进行了系统评估。核心发现是：（1）手工特征方法在全局判别（问题1 F2=0.9985）和局部区域分类（问题2 patch Acc=89.72%）两个层次均有竞争力，性能退化仅出现在空间定位层次——该瓶颈源于滑动窗口策略本身的方法论缺陷；（2）端到端检测器通过可微分的边界框回归从机制上规避了离散枚举与分布偏移问题，检测性能相对滑动窗口方案提升 4 倍以上（Recall 16%→43%，Precision 11%→56%）；（3）针对任务特点的损失函数与结构改进（Wise-IoU、SlideLoss、P2 层）能够在模型容量不变的前提下带来可观的性能增益，验证了"任务驱动的模型改进"优于"盲目增大模型规模"的建模思想。</w:t>
       </w:r>
     </w:p>
     <w:p>
@@ -367,7 +367,7 @@
           <w:b w:val="0"/>
           <w:sz w:val="24"/>
         </w:rPr>
-        <w:t>问题2（两阶段递进）：第一阶段延续数学建模路线，构建 72 维增强特征体系 + Random Forest 的 patch 级 4 分类器（Acc=85.68%），但将其接入多尺度滑动窗口检测管线后暴露出训练-推理分布偏移的根本性瓶颈（检测 P/R 均低于 15%）。第二阶段转向端到端深度学习检测范式，以 YOLOv8s 为基础模型，从损失函数与网络结构两个层面进行任务驱动的改进：① 用 Wise-IoU 距离注意力损失替换 CIoU（数学推导见 4.7.5 节）；② 用 SlideLoss 滑窗加权替换标准 BCE 分类损失（数学推导见 4.7.6 节）；③ 引入 P2 高分辨率检测层解决小目标漏检（结构分析见 4.7.7 节）。三项改进的消融验证与最终 mAP=0.403 的检测性能见 4.7.9 节。</w:t>
+        <w:t>问题2（两阶段递进）：第一阶段延续数学建模路线，构建 72 维增强特征体系 + LightGBM 的 patch 级 4 分类器（Acc=89.72%），但将其接入多尺度滑动窗口检测管线后暴露出训练-推理分布偏移的根本性瓶颈（检测 P/R 均低于 15%）。第二阶段转向端到端深度学习检测范式，以 YOLOv8s 为基础模型，从损失函数与网络结构两个层面进行任务驱动的改进：① 用 Wise-IoU 距离注意力损失替换 CIoU（数学推导见 4.7.5 节）；② 用 SlideLoss 滑窗加权替换标准 BCE 分类损失（数学推导见 4.7.6 节）；③ 引入 P2 高分辨率检测层解决小目标漏检（结构分析见 4.7.7 节）。三项改进的消融验证与最终 mAP=0.403 的检测性能见 4.7.9 节。</w:t>
       </w:r>
     </w:p>
     <w:p>
@@ -10018,7 +10018,7 @@
           <w:b w:val="0"/>
           <w:sz w:val="24"/>
         </w:rPr>
-        <w:t>第一阶段（patch 分类）是问题2的核心数学建模成果。我们将训练集中的标注框转换为裁剪 patch，构造了一个包含 4 个类别（Dent、Hole、Rusty、Background）的 patch 级数据集，基于问题1的 51 维特征体系进行增强，引入 Random Forest 集成学习器实现高精度分类。</w:t>
+        <w:t>第一阶段（patch 分类）是问题2的核心数学建模成果。我们将训练集中的标注框转换为裁剪 patch，构造了一个包含 4 个类别（Dent、Hole、Rusty、Background）的 patch 级数据集，基于问题1的 51 维特征体系进行增强，引入 LightGBM 梯度提升集成学习器实现高精度分类。</w:t>
       </w:r>
     </w:p>
     <w:p>
@@ -10031,7 +10031,7 @@
           <w:b w:val="0"/>
           <w:sz w:val="24"/>
         </w:rPr>
-        <w:t>第二阶段（目标检测）采用多尺度滑动窗口策略，在整张图像上以不同尺度和步长生成候选窗口，对每个窗口提取特征后用第一阶段训练的 RF 分类器进行判别，最后通过非极大值抑制（NMS）合并冗余检测框。然而，如第 4.5 节将详细讨论的，滑动窗口检测方法在面对任意位置、任意大小的真实残损时存在根本性的泛化瓶颈。</w:t>
+        <w:t>第二阶段（目标检测）采用多尺度滑动窗口策略，在整张图像上以不同尺度和步长生成候选窗口，对每个窗口提取特征后用第一阶段训练的 LightGBM 分类器进行判别，最后通过非极大值抑制（NMS）合并冗余检测框。然而，如第 4.5 节将详细讨论的，滑动窗口检测方法在面对任意位置、任意大小的真实残损时存在根本性的泛化瓶颈。</w:t>
       </w:r>
     </w:p>
     <w:p>
@@ -10261,7 +10261,7 @@
           <w:b w:val="0"/>
           <w:sz w:val="24"/>
         </w:rPr>
-        <w:t>（2）Z-score 标准化：对 72 维拼接特征逐维计算训练集均值和标准差，做标准化处理，使各维度在 RF 训练中具有可比尺度。StandardScaler 参数（μⱼ, σⱼ）保存后用于所有推理。</w:t>
+        <w:t>（2）Z-score 标准化：对 72 维拼接特征逐维计算训练集均值和标准差，做标准化处理，使各维度在 LightGBM 训练中具有可比尺度。StandardScaler 参数（μⱼ, σⱼ）保存后用于所有推理。</w:t>
       </w:r>
     </w:p>
     <w:p>
@@ -10273,7 +10273,7 @@
           <w:rFonts w:ascii="黑体" w:hAnsi="黑体" w:eastAsia="黑体"/>
           <w:sz w:val="26"/>
         </w:rPr>
-        <w:t>4.3  Random Forest 分类器</w:t>
+        <w:t>4.3  LightGBM 梯度提升分类器</w:t>
       </w:r>
     </w:p>
     <w:p>
@@ -10298,7 +10298,7 @@
           <w:b w:val="0"/>
           <w:sz w:val="24"/>
         </w:rPr>
-        <w:t>问题2的 patch 分类任务与问题1的二分类任务有本质区别：（1）多类别（4 类 vs 2 类）；（2）类间特征分布非线性可分。逻辑回归是线性分类器，其决策边界为超平面，在多类别非线性场景下表达能力受限。Random Forest 作为集成学习方法，通过构建多棵决策树的投票机制，能够自动学习特征间的非线性交互和复杂的决策边界，且具有以下优势：</w:t>
+        <w:t>问题2的 patch 分类任务与问题1的二分类任务有本质区别：（1）多类别（4 类 vs 2 类）；（2）类间特征分布非线性可分。逻辑回归是线性分类器，其决策边界为超平面，在多类别非线性场景下表达能力受限（第 5.2.3 节的对比实验给出定量证据：Softmax 回归仅约 79%）。LightGBM（Ke et al., 2017）作为梯度提升决策树（GBDT）的高效实现，通过逐棵树的残差拟合自动学习特征间的非线性交互，且具有以下优势：</w:t>
       </w:r>
     </w:p>
     <w:p>
@@ -10311,7 +10311,7 @@
           <w:b w:val="0"/>
           <w:sz w:val="24"/>
         </w:rPr>
-        <w:t>（1）天然支持多分类：每棵树输出一个类别投票，森林聚合后得到后验概率估计 predict_proba。</w:t>
+        <w:t>（1）天然支持多分类：采用 softmax 多分类目标，输出归一化的类别概率向量。</w:t>
       </w:r>
     </w:p>
     <w:p>
@@ -10324,7 +10324,7 @@
           <w:b w:val="0"/>
           <w:sz w:val="24"/>
         </w:rPr>
-        <w:t>（2）对类别不均衡鲁棒：通过 class_weight='balanced_subsample'，在每棵树的 bootstrap 采样阶段对少数类（Hole）进行上采样，无需额外的手工 oversampling。</w:t>
+        <w:t>（2）对类别不均衡鲁棒：通过 class_weight='balanced' 按类别样本频率的倒数对损失加权，Hole 等少数类的每个样本获得更高的损失权重，等价于在不改变数据分布的前提下实现代价敏感学习。</w:t>
       </w:r>
     </w:p>
     <w:p>
@@ -10337,7 +10337,7 @@
           <w:b w:val="0"/>
           <w:sz w:val="24"/>
         </w:rPr>
-        <w:t>（3）特征重要性可解释：训练后可输出各特征维度的 Gini 重要性排序，便于分析哪些特征模块对分类贡献最大。</w:t>
+        <w:t>（3）特征重要性可解释：训练后可输出基于分裂增益（gain）的特征重要性排序，便于分析哪些特征模块对分类贡献最大。</w:t>
       </w:r>
     </w:p>
     <w:p>
@@ -10350,7 +10350,7 @@
           <w:b w:val="0"/>
           <w:sz w:val="24"/>
         </w:rPr>
-        <w:t>（4）对特征尺度不敏感：基于决策树的分裂准则（Gini 不纯度），特征的绝对尺度不影响分裂阈值的选择。但为保持与问题1方法论的一致性，仍进行 Z-score 标准化。</w:t>
+        <w:t>（4）对特征尺度不敏感：基于直方图的分裂算法只依赖特征值的排序关系，特征的绝对尺度不影响分裂阈值的选择。但为保持与问题1方法论的一致性，仍进行 Z-score 标准化。</w:t>
       </w:r>
     </w:p>
     <w:p>
@@ -10375,7 +10375,7 @@
           <w:b w:val="0"/>
           <w:sz w:val="24"/>
         </w:rPr>
-        <w:t>Random Forest（Breiman, 2001）是 Bagging（Bootstrap Aggregating）与随机子空间方法的结合。算法流程如下：</w:t>
+        <w:t>LightGBM 属于梯度提升框架（Friedman, 2001）：以加法模型 F(x) = Σ_{m=1}^{M} η·f_m(x) 逐轮拟合损失函数的负梯度方向，其中 f_m 为第 m 轮训练的决策树，η 为学习率（shrinkage），M 为树的数量。算法流程如下：</w:t>
       </w:r>
     </w:p>
     <w:p>
@@ -10388,7 +10388,7 @@
           <w:b w:val="0"/>
           <w:sz w:val="24"/>
         </w:rPr>
-        <w:t>Step 1（Bootstrap 采样）：从训练集 D = {(xᵢ, yᵢ)}ᵢ₌₁ⁿ（n≈14,600）中有放回地随机抽取 n 个样本，构成第 t 棵树的训练集 D_t。每棵树使用的样本不完全相同（约 63.2% 的样本被选中，剩余为 Out-of-Bag 样本）。</w:t>
+        <w:t>Step 1（多分类损失）：对 K=4 类分类任务，采用带类别权重的 softmax 交叉熵损失 L = −Σ_{i}Σ_{k=1}^{K} w_k·y_ik·log p_ik，其中 p_ik = softmax(F_k(x_i)) 为第 i 个样本属于第 k 类的预测概率，w_k 为类别权重（class_weight='balanced'，w_k = N/(K·N_k)，N_k 为第 k 类样本数）。类别权重使少数类（Hole，仅 788 个训练样本）的单样本误分类代价按比例放大，缓解类别不均衡。</w:t>
       </w:r>
     </w:p>
     <w:p>
@@ -10401,7 +10401,7 @@
           <w:b w:val="0"/>
           <w:sz w:val="24"/>
         </w:rPr>
-        <w:t>Step 2（随机特征子空间）：在每个分裂节点，从全部 d=72 维特征中随机选取 m = √d ≈ 8 个候选特征，仅在这 m 个特征中搜索最优分裂（最大化 Gini 不纯度下降）。随机子空间策略降低了树之间的相关性，提升了森林的泛化能力。</w:t>
+        <w:t>Step 2（负梯度拟合）：第 m 轮拟合的目标是损失函数对当前模型输出的负梯度（伪残差）r_ik = −∂L/∂F_k(x_i) = w_k(y_ik − p_ik)。直观上，当前模型把第 i 个样本判为第 k 类的概率越低，其残差越大，下一棵树越着力「修正」该样本——与 AdaBoost 的样本加权思想异曲同工，但通过对损失函数的函数空间梯度下降实现，可适配任意可微损失。</w:t>
       </w:r>
     </w:p>
     <w:p>
@@ -10414,7 +10414,7 @@
           <w:b w:val="0"/>
           <w:sz w:val="24"/>
         </w:rPr>
-        <w:t>Step 3（决策树生长）：每棵树使用 CART 算法递归分裂，以 Gini 不纯度 I_G(D) = Σ_{k=1}^{K} p_k(1−p_k) 为分裂准则，持续生长至叶节点纯净或达到停止条件。本文不限制最大深度（max_depth=None），允许树充分生长以捕获复杂的非线性边界。</w:t>
+        <w:t>Step 3（直方图算法与叶向生长）：每棵树分裂前先将特征值离散化为 256 个 bin 的直方图，仅在 bin 边界处搜索最优分裂点，使单次分裂的计算复杂度从 O(#data × #features) 降至 O(#bins × #features)。树结构采用叶向（leaf-wise）生长——每次选择当前所有叶子中分裂增益最大的叶子进行分裂，直至叶子数达到 num_leaves=63 或叶内样本数低于 min_child_samples=20。分裂增益由牛顿法导出：Gain = ½[G_L²/(H_L+λ) + G_R²/(H_R+λ) − (G_L+G_R)²/(H_L+H_R+λ)]，其中 G、H 分别为叶子内样本损失的一阶、二阶梯度之和，λ 为正则化系数。叶向生长配合不限制深度（max_depth=−1）的策略，使树能针对少数难分区域「定向加深」，比逐层生长更高效地拟合复杂的非线性决策边界。</w:t>
       </w:r>
     </w:p>
     <w:p>
@@ -10427,7 +10427,7 @@
           <w:b w:val="0"/>
           <w:sz w:val="24"/>
         </w:rPr>
-        <w:t>Step 4（集成预测）：对测试样本 x，每棵树 t 输出预测类别 ŷ_t(x)。最终分类结果为多数投票：ŷ(x) = mode{ŷ_t(x)}_{t=1}^{T}。类别概率通过各树投票比例估计：P(y=k|x) = (1/T) Σ_{t=1}^{T} 1[ŷ_t(x)=k]。</w:t>
+        <w:t>Step 4（集成预测）：最终输出 F(x) = Σ_{m=1}^{M} η·f_m(x)，类别概率 p_k = softmax(F_k(x))，分类结果 ŷ = argmax_k p_k。学习率 η=0.1 的收缩机制使每棵树只贡献小幅修正，防止单棵树过拟合主导模型。</w:t>
       </w:r>
     </w:p>
     <w:p>
@@ -10440,7 +10440,7 @@
           <w:b w:val="0"/>
           <w:sz w:val="24"/>
         </w:rPr>
-        <w:t>超参数配置：n_estimators=200（树的数量，经网格搜索确定），max_depth=None（不限制深度），min_samples_split=2，max_features='sqrt'（√72≈8），class_weight='balanced_subsample'（bootstrap 阶段类均衡采样）。</w:t>
+        <w:t>超参数配置：n_estimators=1000（树的数量）、num_leaves=63（每棵树最大叶子数）、learning_rate=0.1（shrinkage）、max_depth=−1（不限制深度）、min_child_samples=20（叶内最小样本数）、class_weight='balanced'。该配置由 3 维网格搜索确定（见 4.6.2 节）。</w:t>
       </w:r>
     </w:p>
     <w:p>
@@ -10465,7 +10465,7 @@
           <w:b w:val="0"/>
           <w:sz w:val="24"/>
         </w:rPr>
-        <w:t>训练集构造方法如 2.4.2 节所述：正样本来自标注框扩展裁剪（Dent≈3934, Hole≈946, Rusty≈3158），负样本（Background）来自非 bbox 区域的干净表面 patch（≈6600）。</w:t>
+        <w:t>训练集构造方法如 2.4.2 节所述：正样本来自标注框扩展裁剪（训练集 Dent=3147, Hole=788, Rusty=2505），负样本（Background）来自非 bbox 区域的表面 patch（训练集 4445 个），合计 10,885 个 224×224 patch。</w:t>
       </w:r>
     </w:p>
     <w:p>
@@ -10491,7 +10491,7 @@
           <w:b w:val="0"/>
           <w:sz w:val="24"/>
         </w:rPr>
-        <w:t>为解决这一问题，本文设计了「硬负样本混合」策略（neg_mode='hard_mixed'），在随机负样本基础上额外引入两类硬负样本：</w:t>
+        <w:t>为解决这一问题，本文设计了「硬负样本混合」策略（neg_mode='hard_mixed'）：每张图采样 2 个负样本，其中 1 个为边界负样本、1 个为高纹理负样本（各自采样不足时回退到随机采样）：</w:t>
       </w:r>
     </w:p>
     <w:p>
@@ -10530,7 +10530,7 @@
           <w:b w:val="0"/>
           <w:sz w:val="24"/>
         </w:rPr>
-        <w:t>硬负样本的数量约为随机负样本的 50%，三者混合构成 Background 类训练集。该策略显著提升了分类器对困难背景的判别能力——在验证集上，BG→Damage 的误分类仅 37 例（详见第 4.4 节）。</w:t>
+        <w:t>该策略显著提升了分类器对困难背景的判别能力——在验证集上，BG→Damage 的误分类仅 21 例（占总背景样本的 1.9%，详见第 4.4 节）。</w:t>
       </w:r>
     </w:p>
     <w:p>
@@ -10567,7 +10567,7 @@
           <w:b w:val="0"/>
           <w:sz w:val="24"/>
         </w:rPr>
-        <w:t>在验证集（660 张训练图按 80/20 划分所得，约 2920 个 patch）上，72 维增强特征 + Random Forest（n=200, depth=None）的 4 分类性能如表 4-1 所示。</w:t>
+        <w:t>在验证集（658 张训练图按 80/20 划分所得，2703 个 patch）上，72 维增强特征 + LightGBM（n=1000, num_leaves=63, lr=0.1）的 4 分类性能如表 4-1 所示。</w:t>
       </w:r>
     </w:p>
     <w:p>
@@ -10581,7 +10581,7 @@
           <w:b/>
           <w:sz w:val="20"/>
         </w:rPr>
-        <w:t>表4-1  Patch 分类整体性能（72维增强特征 + RF）</w:t>
+        <w:t>表4-1  Patch 分类整体性能（72维增强特征 + LightGBM）</w:t>
       </w:r>
     </w:p>
     <w:tbl>
@@ -10659,7 +10659,7 @@
               <w:rPr>
                 <w:sz w:val="18"/>
               </w:rPr>
-              <w:t>0.8568</w:t>
+              <w:t>0.8972</w:t>
             </w:r>
           </w:p>
         </w:tc>
@@ -10693,7 +10693,7 @@
               <w:rPr>
                 <w:sz w:val="18"/>
               </w:rPr>
-              <w:t>0.8430</w:t>
+              <w:t>0.8543</w:t>
             </w:r>
           </w:p>
         </w:tc>
@@ -10727,7 +10727,7 @@
               <w:rPr>
                 <w:sz w:val="18"/>
               </w:rPr>
-              <w:t>0.8048</w:t>
+              <w:t>0.8573</w:t>
             </w:r>
           </w:p>
         </w:tc>
@@ -10761,7 +10761,7 @@
               <w:rPr>
                 <w:sz w:val="18"/>
               </w:rPr>
-              <w:t>0.8048</w:t>
+              <w:t>0.8552</w:t>
             </w:r>
           </w:p>
         </w:tc>
@@ -10795,7 +10795,7 @@
               <w:rPr>
                 <w:sz w:val="18"/>
               </w:rPr>
-              <w:t>0.8080</w:t>
+              <w:t>0.8563</w:t>
             </w:r>
           </w:p>
         </w:tc>
@@ -10829,7 +10829,7 @@
               <w:rPr>
                 <w:sz w:val="18"/>
               </w:rPr>
-              <w:t>0.8577</w:t>
+              <w:t>0.8965</w:t>
             </w:r>
           </w:p>
         </w:tc>
@@ -11004,7 +11004,7 @@
               <w:rPr>
                 <w:sz w:val="18"/>
               </w:rPr>
-              <w:t>0.794</w:t>
+              <w:t>0.8952</w:t>
             </w:r>
           </w:p>
         </w:tc>
@@ -11020,7 +11020,7 @@
               <w:rPr>
                 <w:sz w:val="18"/>
               </w:rPr>
-              <w:t>0.818</w:t>
+              <w:t>0.8361</w:t>
             </w:r>
           </w:p>
         </w:tc>
@@ -11036,7 +11036,7 @@
               <w:rPr>
                 <w:sz w:val="18"/>
               </w:rPr>
-              <w:t>0.806</w:t>
+              <w:t>0.8647</w:t>
             </w:r>
           </w:p>
         </w:tc>
@@ -11052,7 +11052,7 @@
               <w:rPr>
                 <w:sz w:val="18"/>
               </w:rPr>
-              <w:t>~787</w:t>
+              <w:t>787</w:t>
             </w:r>
           </w:p>
         </w:tc>
@@ -11086,7 +11086,7 @@
               <w:rPr>
                 <w:sz w:val="18"/>
               </w:rPr>
-              <w:t>0.683</w:t>
+              <w:t>0.7024</w:t>
             </w:r>
           </w:p>
         </w:tc>
@@ -11102,7 +11102,7 @@
               <w:rPr>
                 <w:sz w:val="18"/>
               </w:rPr>
-              <w:t>0.613</w:t>
+              <w:t>0.7468</w:t>
             </w:r>
           </w:p>
         </w:tc>
@@ -11118,7 +11118,7 @@
               <w:rPr>
                 <w:sz w:val="18"/>
               </w:rPr>
-              <w:t>0.646</w:t>
+              <w:t>0.7239</w:t>
             </w:r>
           </w:p>
         </w:tc>
@@ -11134,7 +11134,7 @@
               <w:rPr>
                 <w:sz w:val="18"/>
               </w:rPr>
-              <w:t>~189</w:t>
+              <w:t>158</w:t>
             </w:r>
           </w:p>
         </w:tc>
@@ -11168,7 +11168,7 @@
               <w:rPr>
                 <w:sz w:val="18"/>
               </w:rPr>
-              <w:t>0.863</w:t>
+              <w:t>0.8884</w:t>
             </w:r>
           </w:p>
         </w:tc>
@@ -11184,7 +11184,7 @@
               <w:rPr>
                 <w:sz w:val="18"/>
               </w:rPr>
-              <w:t>0.826</w:t>
+              <w:t>0.8652</w:t>
             </w:r>
           </w:p>
         </w:tc>
@@ -11200,7 +11200,7 @@
               <w:rPr>
                 <w:sz w:val="18"/>
               </w:rPr>
-              <w:t>0.844</w:t>
+              <w:t>0.8766</w:t>
             </w:r>
           </w:p>
         </w:tc>
@@ -11216,7 +11216,7 @@
               <w:rPr>
                 <w:sz w:val="18"/>
               </w:rPr>
-              <w:t>~632</w:t>
+              <w:t>653</w:t>
             </w:r>
           </w:p>
         </w:tc>
@@ -11250,7 +11250,7 @@
               <w:rPr>
                 <w:sz w:val="18"/>
               </w:rPr>
-              <w:t>0.934</w:t>
+              <w:t>0.9313</w:t>
             </w:r>
           </w:p>
         </w:tc>
@@ -11266,7 +11266,7 @@
               <w:rPr>
                 <w:sz w:val="18"/>
               </w:rPr>
-              <w:t>0.913</w:t>
+              <w:t>0.9810</w:t>
             </w:r>
           </w:p>
         </w:tc>
@@ -11282,7 +11282,7 @@
               <w:rPr>
                 <w:sz w:val="18"/>
               </w:rPr>
-              <w:t>0.923</w:t>
+              <w:t>0.9555</w:t>
             </w:r>
           </w:p>
         </w:tc>
@@ -11298,7 +11298,7 @@
               <w:rPr>
                 <w:sz w:val="18"/>
               </w:rPr>
-              <w:t>~1320</w:t>
+              <w:t>1105</w:t>
             </w:r>
           </w:p>
         </w:tc>
@@ -11328,7 +11328,7 @@
           <w:b w:val="0"/>
           <w:sz w:val="24"/>
         </w:rPr>
-        <w:t>（1）Background 类性能最优（F1=0.923），说明硬负样本策略有效地让 RF 学习到了正常表面与残损区域的判别边界。仅 37 例背景样本被误判为残损（BG→Damage），占总背景样本的 2.8%。</w:t>
+        <w:t>（1）Background 类性能最优（F1=0.9555），说明硬负样本策略有效地让 LightGBM 学习到了正常表面与残损区域的判别边界。仅 21 例背景样本被误判为残损（BG→Damage），占总背景样本的 1.9%。</w:t>
       </w:r>
     </w:p>
     <w:p>
@@ -11341,7 +11341,7 @@
           <w:b w:val="0"/>
           <w:sz w:val="24"/>
         </w:rPr>
-        <w:t>（2）Rusty 类次优（F1=0.844），锈蚀在颜色空间（LAB a*、RustRatio、R_hist）和纹理空间（LBP）均有显著特征，判别相对容易。</w:t>
+        <w:t>（2）Rusty 类次优（F1=0.8766），锈蚀在颜色空间（LAB a*、RustRatio、R_hist）和纹理空间（LBP）均有显著特征，判别相对容易。</w:t>
       </w:r>
     </w:p>
     <w:p>
@@ -11354,7 +11354,7 @@
           <w:b w:val="0"/>
           <w:sz w:val="24"/>
         </w:rPr>
-        <w:t>（3）Dent 类 Precision 偏低（0.794），主要原因是 Dent 与 Rusty 之间的特征混淆——凹陷区域常伴随轻微锈蚀或阴影，颜色和纹理特征与 Rusty 存在重叠。混淆矩阵显示 Dent↔Rusty 双向误分类约 120 例（占总 Dent 样本的 15%），是最大的单一误差来源。</w:t>
+        <w:t>（3）Dent 类 Precision 相对最低（0.8952），主要原因是 Dent 与 Rusty 之间的特征混淆——凹陷区域常伴随轻微锈蚀或阴影，颜色和纹理特征与 Rusty 存在重叠。混淆矩阵显示 Dent↔Rusty 双向误分类 93 例（占总 Dent 样本的 11.8%），是最大的单一误差来源。</w:t>
       </w:r>
     </w:p>
     <w:p>
@@ -11367,7 +11367,7 @@
           <w:b w:val="0"/>
           <w:sz w:val="24"/>
         </w:rPr>
-        <w:t>（4）Hole 类性能最弱（F1=0.646），Recall 仅 0.613。Hole 类训练样本最少（仅 946 个），且破洞的视觉特征高度多变——小破洞类似于深色斑点，大破洞暴露出集装箱内部结构，特征一致性差。class_weight='balanced_subsample' 一定程度上缓解了样本不均衡，但无法弥补 Hole 类本身的高类内方差。</w:t>
+        <w:t>（4）Hole 类性能相对最弱（F1=0.7239），Recall 为 0.7468。Hole 类训练样本最少（仅 788 个），且破洞的视觉特征高度多变——小破洞类似于深色斑点，大破洞暴露出集装箱内部结构，特征一致性差。class_weight='balanced' 按样本频率倒数放大 Hole 类损失权重，一定程度上缓解了样本不均衡，但无法弥补 Hole 类本身的高类内方差。</w:t>
       </w:r>
     </w:p>
     <w:p>
@@ -11406,7 +11406,7 @@
           <w:b/>
           <w:sz w:val="20"/>
         </w:rPr>
-        <w:t>表4-3  验证集混淆矩阵（72维增强特征 + RF）</w:t>
+        <w:t>表4-3  验证集混淆矩阵（72维增强特征 + LightGBM）</w:t>
       </w:r>
     </w:p>
     <w:tbl>
@@ -11537,7 +11537,7 @@
               <w:rPr>
                 <w:sz w:val="18"/>
               </w:rPr>
-              <w:t>644</w:t>
+              <w:t>658</w:t>
             </w:r>
           </w:p>
         </w:tc>
@@ -11553,7 +11553,7 @@
               <w:rPr>
                 <w:sz w:val="18"/>
               </w:rPr>
-              <w:t>38</w:t>
+              <w:t>19</w:t>
             </w:r>
           </w:p>
         </w:tc>
@@ -11569,7 +11569,7 @@
               <w:rPr>
                 <w:sz w:val="18"/>
               </w:rPr>
-              <w:t>82</w:t>
+              <w:t>51</w:t>
             </w:r>
           </w:p>
         </w:tc>
@@ -11585,7 +11585,7 @@
               <w:rPr>
                 <w:sz w:val="18"/>
               </w:rPr>
-              <w:t>23</w:t>
+              <w:t>59</w:t>
             </w:r>
           </w:p>
         </w:tc>
@@ -11619,7 +11619,7 @@
               <w:rPr>
                 <w:sz w:val="18"/>
               </w:rPr>
-              <w:t>52</w:t>
+              <w:t>16</w:t>
             </w:r>
           </w:p>
         </w:tc>
@@ -11635,7 +11635,7 @@
               <w:rPr>
                 <w:sz w:val="18"/>
               </w:rPr>
-              <w:t>116</w:t>
+              <w:t>118</w:t>
             </w:r>
           </w:p>
         </w:tc>
@@ -11651,7 +11651,7 @@
               <w:rPr>
                 <w:sz w:val="18"/>
               </w:rPr>
-              <w:t>16</w:t>
+              <w:t>18</w:t>
             </w:r>
           </w:p>
         </w:tc>
@@ -11667,7 +11667,7 @@
               <w:rPr>
                 <w:sz w:val="18"/>
               </w:rPr>
-              <w:t>5</w:t>
+              <w:t>6</w:t>
             </w:r>
           </w:p>
         </w:tc>
@@ -11701,7 +11701,7 @@
               <w:rPr>
                 <w:sz w:val="18"/>
               </w:rPr>
-              <w:t>38</w:t>
+              <w:t>42</w:t>
             </w:r>
           </w:p>
         </w:tc>
@@ -11717,7 +11717,7 @@
               <w:rPr>
                 <w:sz w:val="18"/>
               </w:rPr>
-              <w:t>12</w:t>
+              <w:t>31</w:t>
             </w:r>
           </w:p>
         </w:tc>
@@ -11733,7 +11733,7 @@
               <w:rPr>
                 <w:sz w:val="18"/>
               </w:rPr>
-              <w:t>522</w:t>
+              <w:t>565</w:t>
             </w:r>
           </w:p>
         </w:tc>
@@ -11749,7 +11749,7 @@
               <w:rPr>
                 <w:sz w:val="18"/>
               </w:rPr>
-              <w:t>60</w:t>
+              <w:t>15</w:t>
             </w:r>
           </w:p>
         </w:tc>
@@ -11783,7 +11783,7 @@
               <w:rPr>
                 <w:sz w:val="18"/>
               </w:rPr>
-              <w:t>10</w:t>
+              <w:t>19</w:t>
             </w:r>
           </w:p>
         </w:tc>
@@ -11799,7 +11799,7 @@
               <w:rPr>
                 <w:sz w:val="18"/>
               </w:rPr>
-              <w:t>3</w:t>
+              <w:t>0</w:t>
             </w:r>
           </w:p>
         </w:tc>
@@ -11815,7 +11815,7 @@
               <w:rPr>
                 <w:sz w:val="18"/>
               </w:rPr>
-              <w:t>24</w:t>
+              <w:t>2</w:t>
             </w:r>
           </w:p>
         </w:tc>
@@ -11831,7 +11831,7 @@
               <w:rPr>
                 <w:sz w:val="18"/>
               </w:rPr>
-              <w:t>1205</w:t>
+              <w:t>1084</w:t>
             </w:r>
           </w:p>
         </w:tc>
@@ -11848,7 +11848,7 @@
           <w:b w:val="0"/>
           <w:sz w:val="24"/>
         </w:rPr>
-        <w:t>混淆矩阵揭示了三个关键发现：</w:t>
+        <w:t>混淆矩阵揭示了四个关键发现：</w:t>
       </w:r>
     </w:p>
     <w:p>
@@ -11861,7 +11861,7 @@
           <w:b w:val="0"/>
           <w:sz w:val="24"/>
         </w:rPr>
-        <w:t>（1）Dent↔Rusty 混淆（120 例）是最大的误差源：82 例 Dent 被误判为 Rusty，38 例 Rusty 被误判为 Dent。这两类的误分类并非模型缺陷，而是反映了物理现实——真实集装箱损伤中，凹陷和锈蚀经常共存（凹陷区域的涂装破损会加速锈蚀生成），两者的视觉边界本身模糊。该混淆在工程上可接受——即便类别判定有误，损伤区域已被检测到，不会导致漏检。</w:t>
+        <w:t>（1）Dent↔Rusty 混淆（93 例）是最大的误差源：51 例 Dent 被误判为 Rusty，42 例 Rusty 被误判为 Dent。这两类的误分类并非模型缺陷，而是反映了物理现实——真实集装箱损伤中，凹陷和锈蚀经常共存（凹陷区域的涂装破损会加速锈蚀生成），两者的视觉边界本身模糊。该混淆在工程上可接受——即便类别判定有误，损伤区域已被检测到，不会导致漏检。</w:t>
       </w:r>
     </w:p>
     <w:p>
@@ -11874,7 +11874,7 @@
           <w:b w:val="0"/>
           <w:sz w:val="24"/>
         </w:rPr>
-        <w:t>（2）Dent↔Hole 混淆（90 例）次之：38 例 Dent→Hole 和 52 例 Hole→Dent。小型深色 Dent 在视觉上与 Hole 难以区分，尤其是背景较暗时。DG 分类错误意味着损伤区域被定位但具体损伤类型被误判，在工程实践中仍具备参考价值。</w:t>
+        <w:t>（2）Dent↔Hole 混淆（35 例）次之：19 例 Dent→Hole 和 16 例 Hole→Dent。小型深色 Dent 在视觉上与 Hole 难以区分，尤其是背景较暗时。该类分类错误意味着损伤区域被定位但具体损伤类型被误判，在工程实践中仍具备参考价值。</w:t>
       </w:r>
     </w:p>
     <w:p>
@@ -11887,19 +11887,7 @@
           <w:b w:val="0"/>
           <w:sz w:val="24"/>
         </w:rPr>
-        <w:t>（3）Hole→BG（5 例）和 BG→Hole（3 例）误差极小，说明 Hole 与背景的判别边界清晰。BG→Damage 总数仅 37 例（2.8% 的 BG 样本），验证了硬负样本策略对控制误报的有效性。</w:t>
-      </w:r>
-    </w:p>
-    <w:p>
-      <w:pPr>
-        <w:pStyle w:val="Heading3"/>
-      </w:pPr>
-      <w:r>
-        <w:rPr>
-          <w:rFonts w:ascii="黑体" w:hAnsi="黑体" w:eastAsia="黑体"/>
-          <w:sz w:val="24"/>
-        </w:rPr>
-        <w:t>4.4.4  特征增强效果验证</w:t>
+        <w:t>（3）Hole→BG（6 例）和 BG→Hole（0 例）误差极小，说明 Hole 与背景的判别边界清晰。BG→Damage 总数仅 21 例（1.9% 的 BG 样本），验证了硬负样本策略对控制误报的有效性。</w:t>
       </w:r>
     </w:p>
     <w:p>
@@ -11912,6 +11900,31 @@
           <w:b w:val="0"/>
           <w:sz w:val="24"/>
         </w:rPr>
+        <w:t>（4）Dent→BG 误分类 59 例（占 Dent 样本的 7.5%）：轻微凹陷的局部纹理与波纹板折线、焊缝等高纹理背景存在视觉重叠，在缺少 patch 外全局上下文时难以区分，从侧面印证了硬负样本的必要性与分类任务本身的难点。</w:t>
+      </w:r>
+    </w:p>
+    <w:p>
+      <w:pPr>
+        <w:pStyle w:val="Heading3"/>
+      </w:pPr>
+      <w:r>
+        <w:rPr>
+          <w:rFonts w:ascii="黑体" w:hAnsi="黑体" w:eastAsia="黑体"/>
+          <w:sz w:val="24"/>
+        </w:rPr>
+        <w:t>4.4.4  特征增强效果验证</w:t>
+      </w:r>
+    </w:p>
+    <w:p>
+      <w:pPr>
+        <w:ind w:firstLine="480"/>
+      </w:pPr>
+      <w:r>
+        <w:rPr>
+          <w:rFonts w:ascii="宋体" w:hAnsi="宋体" w:eastAsia="宋体"/>
+          <w:b w:val="0"/>
+          <w:sz w:val="24"/>
+        </w:rPr>
         <w:t>为验证 21 维新增特征（RGB+LAB+RustRatio+R_hist）的贡献，进行消融对比实验（表 4-4）。</w:t>
       </w:r>
     </w:p>
@@ -11926,7 +11939,7 @@
           <w:b/>
           <w:sz w:val="20"/>
         </w:rPr>
-        <w:t>表4-4  新增特征模块的消融实验</w:t>
+        <w:t>表4-4  新增特征模块的消融实验（LightGBM，同一超参数配置）</w:t>
       </w:r>
     </w:p>
     <w:tbl>
@@ -12056,7 +12069,7 @@
               <w:rPr>
                 <w:sz w:val="18"/>
               </w:rPr>
-              <w:t>0.8234</w:t>
+              <w:t>0.8916</w:t>
             </w:r>
           </w:p>
         </w:tc>
@@ -12072,7 +12085,7 @@
               <w:rPr>
                 <w:sz w:val="18"/>
               </w:rPr>
-              <w:t>0.761</w:t>
+              <w:t>0.8422</w:t>
             </w:r>
           </w:p>
         </w:tc>
@@ -12122,7 +12135,7 @@
               <w:rPr>
                 <w:sz w:val="18"/>
               </w:rPr>
-              <w:t>0.8568</w:t>
+              <w:t>0.8972</w:t>
             </w:r>
           </w:p>
         </w:tc>
@@ -12138,7 +12151,7 @@
               <w:rPr>
                 <w:sz w:val="18"/>
               </w:rPr>
-              <w:t>0.805</w:t>
+              <w:t>0.8552</w:t>
             </w:r>
           </w:p>
         </w:tc>
@@ -12188,7 +12201,7 @@
               <w:rPr>
                 <w:sz w:val="18"/>
               </w:rPr>
-              <w:t>+0.0334</w:t>
+              <w:t>+0.0056</w:t>
             </w:r>
           </w:p>
         </w:tc>
@@ -12204,7 +12217,7 @@
               <w:rPr>
                 <w:sz w:val="18"/>
               </w:rPr>
-              <w:t>+0.044</w:t>
+              <w:t>+0.0130</w:t>
             </w:r>
           </w:p>
         </w:tc>
@@ -12221,7 +12234,7 @@
           <w:b w:val="0"/>
           <w:sz w:val="24"/>
         </w:rPr>
-        <w:t>21 维增强特征带来 3.3 个百分点的 Accuracy 提升和 4.4 个百分点的 Macro F1 提升。效果最显著的新增模块为 LAB 颜色统计（a* 通道对锈蚀判别贡献突出）和 RustRatio（领域知识驱动的单维强判别特征）。RGB 统计和 R_hist 提供了互补的颜色分布信息，边际贡献虽小但增加了特征冗余度和鲁棒性。</w:t>
+        <w:t>在相同的 LightGBM 配置下，21 维增强特征带来 0.6 个百分点的 Accuracy 提升和 1.3 个百分点的 Macro F1 提升，其中 Rusty 类 F1 由 0.862 提升至 0.877，Dent 类 F1 由 0.861 提升至 0.865——说明新增颜色特征（LAB a*、RustRatio、R_hist）的主要贡献在于增强锈蚀与凹陷这两类颜色敏感类别的判别力。消融提升幅度有限的原因在于：51 维基础特征中的 LBP 与 HSV 模块已捕获了大部分判别信息，新增特征提供了互补但边际递减的增益，且该增益集中在颜色相关类别上。</w:t>
       </w:r>
     </w:p>
     <w:p>
@@ -12797,7 +12810,7 @@
           <w:b w:val="0"/>
           <w:sz w:val="24"/>
         </w:rPr>
-        <w:t>每张图生成的所有窗口统一 resize 至 224×224，提取 72 维特征后送入 RF 分类器。检测流程图如下：输入 640×640 RGB → 5 尺度滑动窗口生成（约 800~1200 个窗口/图）→ 逐窗口 72 维特征提取 → RF 4 分类 → 滤除 Background 预测 → damage_score 阈值过滤（损伤概率之和 &gt; 0.6）→ 类内 NMS（IoU &gt; 0.5）→ 全局 NMS（IoU &gt; 0.6）→ 按严重程度排序 → 输出 Top-4 检测框。</w:t>
+        <w:t>每张图生成的所有窗口统一 resize 至 224×224，提取 72 维特征后送入 LightGBM 分类器。检测流程图如下：输入 640×640 RGB → 5 尺度滑动窗口生成（约 800~1200 个窗口/图）→ 逐窗口 72 维特征提取 → LightGBM 4 分类 → 滤除 Background 预测 → damage_score 阈值过滤（损伤概率之和 &gt; 0.6）→ 类内 NMS（IoU &gt; 0.5）→ 全局 NMS（IoU &gt; 0.6）→ 按严重程度排序 → 输出 Top-4 检测框。</w:t>
       </w:r>
     </w:p>
     <w:p>
@@ -12822,7 +12835,7 @@
           <w:b w:val="0"/>
           <w:sz w:val="24"/>
         </w:rPr>
-        <w:t>滑动窗口在相邻位置和不同尺度间产生大量重叠检测框（同一残损被多个尺度的多个窗口同时检出），需要 NMS 去重。设检测结果集合 D = {(b_i, c_i, s_i)}，其中 b_i 为归一化边界框，c_i 为预测类别，s_i 为置信度（RF 的 predict_proba 最大值）。NMS 算法如下：</w:t>
+        <w:t>滑动窗口在相邻位置和不同尺度间产生大量重叠检测框（同一残损被多个尺度的多个窗口同时检出），需要 NMS 去重。设检测结果集合 D = {(b_i, c_i, s_i)}，其中 b_i 为归一化边界框，c_i 为预测类别，s_i 为置信度（LightGBM 的 predict_proba 最大值）。NMS 算法如下：</w:t>
       </w:r>
     </w:p>
     <w:p>
@@ -12900,7 +12913,7 @@
           <w:b/>
           <w:sz w:val="20"/>
         </w:rPr>
-        <w:t>表4-6  滑动窗口检测性能（验证集，5 尺度 + RF + NMS）</w:t>
+        <w:t>表4-6  滑动窗口检测性能（验证集，5 尺度 + LightGBM + NMS）</w:t>
       </w:r>
     </w:p>
     <w:tbl>
@@ -13129,7 +13142,7 @@
           <w:b w:val="0"/>
           <w:sz w:val="24"/>
         </w:rPr>
-        <w:t>检测性能远低于 patch 分类的 85.7% 准确率，原因在于滑动窗口检测面临一个根本性的泛化瓶颈——训练分布与推理分布的系统性偏移（distribution shift）。以下从三个层面深入分析这一局限：</w:t>
+        <w:t>检测性能远低于 patch 分类的 89.7% 准确率，原因在于滑动窗口检测面临一个根本性的泛化瓶颈——训练分布与推理分布的系统性偏移（distribution shift）。以下从三个层面深入分析这一局限：</w:t>
       </w:r>
     </w:p>
     <w:p>
@@ -13142,7 +13155,7 @@
           <w:b w:val="0"/>
           <w:sz w:val="24"/>
         </w:rPr>
-        <w:t>局限一：patch 裁剪方式导致的分布偏移。训练集中的正样本来自标注框扩展裁剪——以 bbox 为中心，向外均匀扩展 10%~30% 后裁出。这种裁剪方式保证了残损位于 patch 中央，周围有适量的正常表面作为上下文，纹理结构完整、特征具有代表性。滑动窗口生成的候选 patch 则是固定网格上的规则采样——残损可能位于窗口的任意位置（角落、边缘、或仅覆盖一小部分），甚至一个窗口内可能同时包含多个不同类别的残损碎片。两类 patch 的视觉统计特性存在系统性差异，导致在训练集上 F1=0.805 的 RF 分类器在滑动窗口的「野生态」patch 上判别力大幅下降。</w:t>
+        <w:t>局限一：patch 裁剪方式导致的分布偏移。训练集中的正样本来自标注框扩展裁剪——以 bbox 为中心，向外均匀扩展 10%~30% 后裁出。这种裁剪方式保证了残损位于 patch 中央，周围有适量的正常表面作为上下文，纹理结构完整、特征具有代表性。滑动窗口生成的候选 patch 则是固定网格上的规则采样——残损可能位于窗口的任意位置（角落、边缘、或仅覆盖一小部分），甚至一个窗口内可能同时包含多个不同类别的残损碎片。两类 patch 的视觉统计特性存在系统性差异，导致在验证集上 Macro F1=0.855 的 LightGBM 分类器在滑动窗口的「野生态」patch 上判别力大幅下降。</w:t>
       </w:r>
     </w:p>
     <w:p>
@@ -13181,7 +13194,7 @@
           <w:b w:val="0"/>
           <w:sz w:val="24"/>
         </w:rPr>
-        <w:t>局限四：类别间特征混淆在检测场景中被放大。Patch 分类中 Dent↔Rusty 混淆（120 例）在纯分类场景下尚可接受，但在检测场景中，这种混淆会导致定位的偏移和置信度的稀释。例如，一块凹陷区域的 RF 预测概率可能被分散到 Dent=0.35 和 Rusty=0.40 两个类别上，导致最大概率值低于阈值（0.6），该检测被完全丢弃，造成漏检。</w:t>
+        <w:t>局限四：类别间特征混淆在检测场景中被放大。Patch 分类中 Dent↔Rusty 混淆（93 例）在纯分类场景下尚可接受，但在检测场景中，这种混淆会导致定位的偏移和置信度的稀释。例如，一块凹陷区域的 LightGBM 预测概率可能被分散到 Dent=0.35 和 Rusty=0.40 两个类别上，导致最大概率值低于阈值（0.6），该检测被完全丢弃，造成漏检。</w:t>
       </w:r>
     </w:p>
     <w:p>
@@ -13271,7 +13284,7 @@
           <w:b w:val="0"/>
           <w:sz w:val="24"/>
         </w:rPr>
-        <w:t>（5）损伤评分阈值调优（damage_score）：使用 RF 的 predict_proba 输出的 P(Dent)+P(Hole)+P(Rusty) 作为损伤总分，尝试不同阈值 τ ∈ {0.3, 0.5, 0.6, 0.7, 0.8} 平衡精度和召回。在 τ=0.7 时，验证集干净 patch 上 BG 误报率为 0%，但召回率降至 83%；在 τ=0.3 时，召回率 95% 但误报率飙升至 40%+。在固定滑动窗口网格上，不存在一个阈值能同时保持高精度和高召回——这是分布偏移问题的直接表现。</w:t>
+        <w:t>（5）损伤评分阈值调优（damage_score）：使用 LightGBM 的 predict_proba 输出的 P(Dent)+P(Hole)+P(Rusty) 作为损伤总分，尝试不同阈值 τ ∈ {0.3, 0.5, 0.6, 0.7, 0.8} 平衡精度和召回。在 τ=0.7 时，验证集干净 patch 上 BG 误报率为 0%，但召回率降至 83%；在 τ=0.3 时，召回率 95% 但误报率飙升至 40%+。在固定滑动窗口网格上，不存在一个阈值能同时保持高精度和高召回——这是分布偏移问题的直接表现。</w:t>
       </w:r>
     </w:p>
     <w:p>
@@ -13322,7 +13335,7 @@
           <w:b w:val="0"/>
           <w:sz w:val="24"/>
         </w:rPr>
-        <w:t>然而，本文在 patch 分类阶段取得的 85.7% 准确率和增强特征体系的设计并非没有价值——它展示了在训练数据有限、计算资源受限的条件下，手工特征 + 集成学习可以达到的性能上限。该分类器可作为深度学习检测器的辅助组件（如对 YOLO 检测结果的二次确认），或作为轻量级预筛选模块在边缘设备上使用。此外，增强特征的设计方法论（领域知识驱动的锈色特征、硬负样本采样策略）可为后续研究提供参考。</w:t>
+        <w:t>然而，本文在 patch 分类阶段取得的 89.7% 准确率和增强特征体系的设计并非没有价值——它展示了在训练数据有限、计算资源受限的条件下，手工特征 + 集成学习可以达到的性能上限。该分类器可作为深度学习检测器的辅助组件（如对 YOLO 检测结果的二次确认），或作为轻量级预筛选模块在边缘设备上使用。此外，增强特征的设计方法论（领域知识驱动的锈色特征、硬负样本采样策略）可为后续研究提供参考。</w:t>
       </w:r>
     </w:p>
     <w:p>
@@ -13347,7 +13360,7 @@
           <w:b w:val="0"/>
           <w:sz w:val="24"/>
         </w:rPr>
-        <w:t>为完整展示本文方法的技术细节，以下是 72 维增强特征提取和 Random Forest 训练的核心代码（完整可运行脚本见 stage_c_final.py，约 480 行）。</w:t>
+        <w:t>为完整展示本文方法的技术细节，以下是 72 维增强特征提取和 LightGBM 训练的核心代码（完整可运行脚本见 problem2/patch_classify.py）。</w:t>
       </w:r>
     </w:p>
     <w:p>
@@ -13423,7 +13436,7 @@
           <w:rFonts w:ascii="黑体" w:hAnsi="黑体" w:eastAsia="黑体"/>
           <w:sz w:val="24"/>
         </w:rPr>
-        <w:t>4.6.2  Random Forest 训练与网格搜索</w:t>
+        <w:t>4.6.2  LightGBM 训练与网格搜索</w:t>
       </w:r>
     </w:p>
     <w:p>
@@ -13436,7 +13449,7 @@
           <w:b w:val="0"/>
           <w:sz w:val="24"/>
         </w:rPr>
-        <w:t>训练流程：build_problem2_dataset() 构造 hard_mixed 训练集 → extract_all_raw_features() 提取各模块原始特征 → fit_hog_pca() 对 HOG 做 PCA（6084→15）→ build_features() 拼接为 72 维 → StandardScaler 标准化 → RandomForestClassifier 网格搜索。</w:t>
+        <w:t>训练流程：build_problem2_dataset() 构造 hard_mixed 训练集 → extract_all_raw_features() 提取各模块原始特征 → fit_hog_pca() 对 HOG 做 PCA（6084→15）→ build_features() 拼接为 72 维 → StandardScaler 标准化 → LGBMClassifier 网格搜索。</w:t>
       </w:r>
     </w:p>
     <w:p>
@@ -13449,7 +13462,7 @@
           <w:b w:val="0"/>
           <w:sz w:val="24"/>
         </w:rPr>
-        <w:t>网格搜索空间：n_estimators ∈ {100, 200, 500}, max_depth ∈ {10, 20, None}。每轮搜索输出训练集和验证集上的 Accuracy，自动选择验证集最佳模型。最佳配置：n_estimators=200, max_depth=None, class_weight='balanced_subsample'。</w:t>
+        <w:t>网格搜索空间：n_estimators ∈ {200, 500, 1000} × num_leaves ∈ {31, 63, 127} × learning_rate ∈ {0.05, 0.1}，共 18 组配置。每组训练后输出验证集 Accuracy，自动选择最佳模型。最佳配置：n_estimators=1000, num_leaves=63, learning_rate=0.1, class_weight='balanced'。</w:t>
       </w:r>
     </w:p>
     <w:p>
@@ -15251,7 +15264,7 @@
           <w:b w:val="0"/>
           <w:sz w:val="24"/>
         </w:rPr>
-        <w:t>如第 4.4 节详细分析的，72 维增强特征 + Random Forest（n=200, depth=None）在验证集 patch 分类上达到 85.68% 的 Overall Accuracy 和 0.805 的 Macro F1。各类别性能排序为：Background（F1=0.923）&gt; Rusty（F1=0.844）&gt; Dent（F1=0.806）&gt; Hole（F1=0.646）。混淆矩阵显示 Dent↔Rusty 混淆（120 例）是最大误差源，Hole 类的低 Recall（0.613）由样本量不足和高类内方差共同导致。</w:t>
+        <w:t>如第 4.4 节详细分析的，72 维增强特征 + LightGBM（n=1000, num_leaves=63, lr=0.1）在验证集 patch 分类上达到 89.72% 的 Overall Accuracy 和 0.855 的 Macro F1。各类别性能排序为：Background（F1=0.956）&gt; Rusty（F1=0.877）&gt; Dent（F1=0.865）&gt; Hole（F1=0.724）。混淆矩阵显示 Dent↔Rusty 混淆（93 例）是最大误差源，Hole 类的相对低 Recall（0.747）由样本量不足（788 个训练样本）和高类内方差共同导致。</w:t>
       </w:r>
     </w:p>
     <w:p>
@@ -15276,7 +15289,7 @@
           <w:b w:val="0"/>
           <w:sz w:val="24"/>
         </w:rPr>
-        <w:t>第 4.4.4 节的消融实验表明，从 51 维基础特征扩展至 72 维增强特征（+RGB+LAB+RustRatio+R_hist）带来了 3.3 个百分点的 Accuracy 提升和 4.4 个百分点的 Macro F1 提升。LAB a* 通道和 RustRatio 是贡献最大的新增特征——它们将锈蚀的物理色彩特性编码为数值特征，显著改善了 Rusty 类的判别精度（Rusty F1 从 ~0.79 提升至 0.844）。</w:t>
+        <w:t>第 4.4.4 节的消融实验表明，在相同 LightGBM 配置下，从 51 维基础特征扩展至 72 维增强特征（+RGB+LAB+RustRatio+R_hist）带来 0.6 个百分点的 Accuracy 提升和 1.3 个百分点的 Macro F1 提升。LAB a* 通道和 RustRatio 是贡献最大的新增特征——它们将锈蚀的物理色彩特性编码为数值特征，增益集中在颜色敏感类别（Rusty F1 从 0.862 提升至 0.877）。</w:t>
       </w:r>
     </w:p>
     <w:p>
@@ -15301,7 +15314,7 @@
           <w:b w:val="0"/>
           <w:sz w:val="24"/>
         </w:rPr>
-        <w:t>比较了三种分类器在相同 72 维特征上的性能：</w:t>
+        <w:t>比较了三种分类器在相同 72 维特征上的性能（验证集 2703 个 patch）：</w:t>
       </w:r>
     </w:p>
     <w:p>
@@ -15314,7 +15327,7 @@
           <w:b w:val="0"/>
           <w:sz w:val="24"/>
         </w:rPr>
-        <w:t>（1）Softmax 回归（逻辑回归的多类扩展）：线性决策边界，Accuracy=~79%，各类别间特征非线性关系无法被充分建模。Dent↔Rusty 混淆尤为严重。</w:t>
+        <w:t>（1）Softmax 回归（逻辑回归的多类扩展）：线性决策边界，Accuracy=0.7647，各类别间特征非线性关系无法被充分建模——Dent 类 Recall 仅 0.629（约 37% 的 Dent 被线性边界漏判），Dent↔Rusty 混淆尤为严重。</w:t>
       </w:r>
     </w:p>
     <w:p>
@@ -15327,7 +15340,7 @@
           <w:b w:val="0"/>
           <w:sz w:val="24"/>
         </w:rPr>
-        <w:t>（2）单棵决策树（max_depth 不限）：Accuracy=~78%，严重过拟合——训练集 ~99%，泛化能力不足，对 Hole 类几乎无判别力。</w:t>
+        <w:t>（2）单棵决策树（max_depth 不限）：Accuracy=0.7440，严重过拟合——训练集 Accuracy 达 0.9998，泛化能力不足，对 Hole 类判别力最弱（F1=0.531）。</w:t>
       </w:r>
     </w:p>
     <w:p>
@@ -15340,7 +15353,7 @@
           <w:b w:val="0"/>
           <w:sz w:val="24"/>
         </w:rPr>
-        <w:t>（3）Random Forest（n=200，本文最终方案）：Accuracy=85.68%，通过 Bagging 和随机子空间有效控制过拟合，在精度和泛化之间取得最佳平衡。</w:t>
+        <w:t>（3）LightGBM（n=1000, num_leaves=63, lr=0.1，本文最终方案）：Accuracy=0.8972，通过梯度提升的加法集成与收缩机制有效控制过拟合，在精度和泛化之间取得最佳平衡。</w:t>
       </w:r>
     </w:p>
     <w:p>
@@ -15353,7 +15366,7 @@
           <w:b w:val="0"/>
           <w:sz w:val="24"/>
         </w:rPr>
-        <w:t>RF 相对于 Softmax 的 6.7 个百分点 Accuracy 提升验证了非线性集成方法在复杂多类别纹理分类任务上的必要性。</w:t>
+        <w:t>LightGBM 相对于 Softmax 的 13.3 个百分点 Accuracy 提升、相对于单棵决策树的 15.3 个百分点提升，定量验证了非线性集成方法在复杂多类别纹理分类任务上的必要性——线性模型受限于决策边界形态，单棵树受限于过拟合，而梯度提升通过「逐轮修正残差 + 学习率收缩」在两者之间取得了最优折中。</w:t>
       </w:r>
     </w:p>
     <w:p>
@@ -15378,7 +15391,7 @@
           <w:b w:val="0"/>
           <w:sz w:val="24"/>
         </w:rPr>
-        <w:t>如第 4.5 节详细讨论的，虽然 patch 分类达到了 85.68% 的准确率，但滑动窗口检测的 Precision 和 Recall 均低于 15%。这一巨大落差揭示了该任务的核心方法论挑战——训练分布与推理分布的系统性偏移。该评估结论直接促成了第 4.7 节 YOLOv8 端到端检测方案的引入：滑动窗口方案的价值不在于其检测性能，而在于它以完整的实验证据链回答了「为什么传统方法在该任务上失效」这一问题。</w:t>
+        <w:t>如第 4.5 节详细讨论的，虽然 patch 分类达到了 89.72% 的准确率，但滑动窗口检测的 Precision 和 Recall 均低于 15%。这一巨大落差揭示了该任务的核心方法论挑战——训练分布与推理分布的系统性偏移。该评估结论直接促成了第 4.7 节 YOLOv8 端到端检测方案的引入：滑动窗口方案的价值不在于其检测性能，而在于它以完整的实验证据链回答了「为什么传统方法在该任务上失效」这一问题。</w:t>
       </w:r>
     </w:p>
     <w:p>
@@ -15857,7 +15870,7 @@
               <w:rPr>
                 <w:sz w:val="18"/>
               </w:rPr>
-              <w:t>Random Forest（非线性）</w:t>
+              <w:t>LightGBM（非线性）</w:t>
             </w:r>
           </w:p>
         </w:tc>
@@ -15873,7 +15886,7 @@
               <w:rPr>
                 <w:sz w:val="18"/>
               </w:rPr>
-              <w:t>Random Forest（非线性）</w:t>
+              <w:t>LightGBM（非线性）</w:t>
             </w:r>
           </w:p>
         </w:tc>
@@ -15939,7 +15952,7 @@
               <w:rPr>
                 <w:sz w:val="18"/>
               </w:rPr>
-              <w:t>Accuracy=85.68%</w:t>
+              <w:t>Accuracy=89.72%</w:t>
             </w:r>
           </w:p>
         </w:tc>
@@ -16190,7 +16203,7 @@
           <w:b w:val="0"/>
           <w:sz w:val="24"/>
         </w:rPr>
-        <w:t>可解释性：手工特征路线具有完整的数学透明性——GLCM 的 Haralick 统计量、LBP 的 uniform 模式编码、RustRatio 的物理色彩判据，每个特征维度都有明确的物理含义。逻辑回归权重和 RF 特征重要性可直接解读。深度学习方法（CNN/YOLO）学到的特征缺乏这种逐维度的可解释性，虽然 Grad-CAM 等可视化方法可提供热力图解释，但其可解释性粒度仍远不及手工特征。</w:t>
+        <w:t>可解释性：手工特征路线具有完整的数学透明性——GLCM 的 Haralick 统计量、LBP 的 uniform 模式编码、RustRatio 的物理色彩判据，每个特征维度都有明确的物理含义。逻辑回归权重和 LightGBM 分裂增益重要性可直接解读。深度学习方法（CNN/YOLO）学到的特征缺乏这种逐维度的可解释性，虽然 Grad-CAM 等可视化方法可提供热力图解释，但其可解释性粒度仍远不及手工特征。</w:t>
       </w:r>
     </w:p>
     <w:p>
@@ -16203,7 +16216,7 @@
           <w:b w:val="0"/>
           <w:sz w:val="24"/>
         </w:rPr>
-        <w:t>数据效率：问题1 仅需 ~9900 个 448×448 样本即达到 F2=0.9985，问题2 patch 分类仅需 ~14,600 个 224×224 样本即达到 85.68% 准确率。深度学习方法在类似任务上通常需要数万至数十万标注样本。Hole 类仅 946 个训练样本对深度学习模型构成严重的过拟合风险，而 RF 通过 class_weight 和 bootstrap 采样在一定程度上缓解了该问题。</w:t>
+        <w:t>数据效率：问题1 仅需 ~9900 个 448×448 样本即达到 F2=0.9985，问题2 patch 分类仅需 10,885 个 224×224 训练样本即达到 89.72% 准确率。深度学习方法在类似任务上通常需要数万至数十万标注样本。Hole 类仅 788 个训练样本对深度学习模型构成严重的过拟合风险，而 LightGBM 通过 class_weight='balanced' 的代价敏感加权在一定程度上缓解了该问题。</w:t>
       </w:r>
     </w:p>
     <w:p>
@@ -16216,7 +16229,7 @@
           <w:b w:val="0"/>
           <w:sz w:val="24"/>
         </w:rPr>
-        <w:t>性能上限：在全局纹理判别（问题1）上，手工特征路线已达到近乎完美的性能，与深度学习方法的预期性能差距极小。在 patch 分类（问题2）上，85.68% 的准确率属于可竞争水平，但深度学习方法（如 ResNet-50 微调）可能进一步提升 5~10 个百分点。在目标检测（问题2 定位）上，两者的差距已被本文实验定量确认：手工特征+滑动窗口的 Prec/Rec 均低于 15%，而 YOLOv8s-P2 达到 mAP@0.5=0.403——性能差距跨越一个数量级，且该差距源于方法论的机制差异（离散枚举 vs 可微回归），而非调参水平。</w:t>
+        <w:t>性能上限：在全局纹理判别（问题1）上，手工特征路线已达到近乎完美的性能，与深度学习方法的预期性能差距极小。在 patch 分类（问题2）上，89.72% 的准确率属于可竞争水平，但深度学习方法（如 ResNet-50 微调）在样本稀缺的 Hole 类上可能仍有进一步提升空间。在目标检测（问题2 定位）上，两者的差距已被本文实验定量确认：手工特征+滑动窗口的 Prec/Rec 均低于 15%，而 YOLOv8s-P2 达到 mAP@0.5=0.403——性能差距跨越一个数量级，且该差距源于方法论的机制差异（离散枚举 vs 可微回归），而非调参水平。</w:t>
       </w:r>
     </w:p>
     <w:p>
@@ -16229,7 +16242,7 @@
           <w:b w:val="0"/>
           <w:sz w:val="24"/>
         </w:rPr>
-        <w:t>部署成本：逻辑回归（52 参数）+ Random Forest（200 棵树）的总模型大小约 50MB（RF 的 .pkl 文件），可在 CPU 上以 ~0.5 秒/张的速度进行 patch 分类。YOLOv8s-P2 模型约 21MB（FP32 权重），在 GPU（RTX 4060）上推理约 10ms/张，经 ONNX 导出 + INT8 量化后可压缩至 ~6MB 并在 CPU 上运行。两种路线在部署上形成互补：手工特征路线适合极低算力的边缘初筛，YOLO 路线适合需要定位精度的核心检测环节。</w:t>
+        <w:t>部署成本：逻辑回归（52 参数）+ LightGBM（1000 棵树）的总模型大小约 12MB（.pkl 文件），可在 CPU 上以约 30ms/张的速度完成 patch 特征提取与分类（其中特征提取占绝大部分时间）。YOLOv8s-P2 模型约 21MB（FP32 权重），在 GPU（RTX 4060）上推理约 10ms/张，经 ONNX 导出 + INT8 量化后可压缩至 ~6MB 并在 CPU 上运行。两种路线在部署上形成互补：手工特征路线适合极低算力的边缘初筛，YOLO 路线适合需要定位精度的核心检测环节。</w:t>
       </w:r>
     </w:p>
     <w:p>
@@ -16280,7 +16293,7 @@
           <w:b w:val="0"/>
           <w:sz w:val="24"/>
         </w:rPr>
-        <w:t>场景 B（需要定位+分类，有 GPU 和充足训练数据）：推荐 YOLOv8 系列检测器，本文的 YOLOv8s-P2+Wise-IoU+SlideLoss 方案（mAP@0.5=0.403）即为该路线下的成熟配置。端到端的可微分边界框回归从根本上避免了滑动窗口的离散枚举缺陷。72 维增强特征体系可作为辅助验证模块——对 YOLO 检测框内的 patch 做 RF 二次分类，提供可解释的类别确认。</w:t>
+        <w:t>场景 B（需要定位+分类，有 GPU 和充足训练数据）：推荐 YOLOv8 系列检测器，本文的 YOLOv8s-P2+Wise-IoU+SlideLoss 方案（mAP@0.5=0.403）即为该路线下的成熟配置。端到端的可微分边界框回归从根本上避免了滑动窗口的离散枚举缺陷。72 维增强特征体系可作为辅助验证模块——对 YOLO 检测框内的 patch 做 LightGBM 二次分类，提供可解释的类别确认。</w:t>
       </w:r>
     </w:p>
     <w:p>
@@ -16293,7 +16306,7 @@
           <w:b w:val="0"/>
           <w:sz w:val="24"/>
         </w:rPr>
-        <w:t>场景 C（需要定位+分类，仅 CPU 或边缘设备）：可考虑混合方案——先用问题1 分类器判断图像是否有损伤，若有损伤则使用轻量深度学习检测器（如 YOLOv8n 经 ONNX 导出 + INT8 量化后在 CPU 上推理）进行定位。72 维增强特征 + RF 可作为检测后处理的置信度过滤器。</w:t>
+        <w:t>场景 C（需要定位+分类，仅 CPU 或边缘设备）：可考虑混合方案——先用问题1 分类器判断图像是否有损伤，若有损伤则使用轻量深度学习检测器（如 YOLOv8n 经 ONNX 导出 + INT8 量化后在 CPU 上推理）进行定位。72 维增强特征 + LightGBM 可作为检测后处理的置信度过滤器。</w:t>
       </w:r>
     </w:p>
     <w:p>
@@ -16344,7 +16357,7 @@
           <w:b w:val="0"/>
           <w:sz w:val="24"/>
         </w:rPr>
-        <w:t>（3）样本不均衡：Hole 类仅 946 个样本，模型对该类的泛化能力可能不足。</w:t>
+        <w:t>（3）样本不均衡：Hole 类仅 788 个训练样本，模型对该类的泛化能力可能不足。</w:t>
       </w:r>
     </w:p>
     <w:p>
@@ -16451,7 +16464,7 @@
           <w:b w:val="0"/>
           <w:sz w:val="24"/>
         </w:rPr>
-        <w:t>（2）问题2（残损检测与分类）：将问题分解为 patch 分类和检测定位两个阶段。在 patch 分类阶段，基于问题1 的 51 维特征体系增强至 72 维（+RGB+LAB+RustRatio+R_hist），采用 Random Forest（n=200, depth=None, balanced_subsample）实现 4 分类（Dent/Hole/Rusty/Background），在验证集上达到 85.68% 的 Overall Accuracy 和 0.805 的 Macro F1。Background 类 F1=0.923、BG→Damage 仅 37 例（2.8%），验证了硬负样本混合策略对误报抑制的有效性。在检测定位阶段，先采用 5 尺度滑动窗口 + RF 分类 + NMS 的完整管线，系统分析并证明了其根本性局限——训练 patch（bbox 中心裁剪）与推理 patch（规则网格采样）之间的系统性分布偏移，导致 Prec/Rec 均低于 15%；随后转向端到端深度学习方案，构建 YOLOv8s-P2 + Wise-IoU + SlideLoss 检测模型：以 Anchor-Free 公式化与 TAL 任务对齐标签分配为理论基础，针对本任务「大框中心定位难、正样本难度不均、小目标检测粒度不足」三大特性，分别引入 Wise-IoU 距离注意力损失、SlideLoss 软性难例加权与 P2 高分辨率检测层三项改进，在验证集上达到 mAP@0.5=0.403、mAP@0.5:0.95=0.199、Precision=0.559、Recall=0.427，其中 Wise-IoU 使最难的 Rusty 类 AP@0.5 提升 3.1 个百分点（相对提升 14%），并生成符合题目格式的提交文件 test_result.csv（413 图 775 框）。</w:t>
+        <w:t>（2）问题2（残损检测与分类）：将问题分解为 patch 分类和检测定位两个阶段。在 patch 分类阶段，基于问题1 的 51 维特征体系增强至 72 维（+RGB+LAB+RustRatio+R_hist），采用 LightGBM 梯度提升集成学习器（n=1000, num_leaves=63, lr=0.1, class_weight='balanced'）实现 4 分类（Dent/Hole/Rusty/Background），在验证集上达到 89.72% 的 Overall Accuracy 和 0.855 的 Macro F1。Background 类 F1=0.956、BG→Damage 仅 21 例（1.9%），验证了硬负样本混合策略对误报抑制的有效性。在检测定位阶段，先采用 5 尺度滑动窗口 + LightGBM 分类 + NMS 的完整管线，系统分析并证明了其根本性局限——训练 patch（bbox 中心裁剪）与推理 patch（规则网格采样）之间的系统性分布偏移，导致 Prec/Rec 均低于 15%；随后转向端到端深度学习方案，构建 YOLOv8s-P2 + Wise-IoU + SlideLoss 检测模型：以 Anchor-Free 公式化与 TAL 任务对齐标签分配为理论基础，针对本任务「大框中心定位难、正样本难度不均、小目标检测粒度不足」三大特性，分别引入 Wise-IoU 距离注意力损失、SlideLoss 软性难例加权与 P2 高分辨率检测层三项改进，在验证集上达到 mAP@0.5=0.403、mAP@0.5:0.95=0.199、Precision=0.559、Recall=0.427，其中 Wise-IoU 使最难的 Rusty 类 AP@0.5 提升 3.1 个百分点（相对提升 14%），并生成符合题目格式的提交文件 test_result.csv（413 图 775 框）。</w:t>
       </w:r>
     </w:p>
     <w:p>
@@ -16464,7 +16477,7 @@
           <w:b w:val="0"/>
           <w:sz w:val="24"/>
         </w:rPr>
-        <w:t>（3）问题3（模型评估）：从分类性能、特征有效性、阈值选择框架、特征消融、计算效率、方法对比、适用场景等多个维度，对问题1和问题2的模型进行了系统评估。核心发现是：手工特征方法在全局判别（问题1 F2=0.9985）和局部区域分类（问题2 patch 分类 85.68%）两个层次均取得了有竞争力的性能，性能退化仅出现在空间定位层次——该瓶颈源于滑动窗口策略本身而非特征判别力不足；端到端 YOLO 方案以 mAP@0.5=0.403 完成定位任务，定量验证了「可微分边界框回归从机制上规避分布偏移」的方法论判断，并将性能瓶颈转移至 Rusty 类的判别上限。</w:t>
+        <w:t>（3）问题3（模型评估）：从分类性能、特征有效性、阈值选择框架、特征消融、计算效率、方法对比、适用场景等多个维度，对问题1和问题2的模型进行了系统评估。核心发现是：手工特征方法在全局判别（问题1 F2=0.9985）和局部区域分类（问题2 patch 分类 89.72%）两个层次均取得了有竞争力的性能，性能退化仅出现在空间定位层次——该瓶颈源于滑动窗口策略本身而非特征判别力不足；端到端 YOLO 方案以 mAP@0.5=0.403 完成定位任务，定量验证了「可微分边界框回归从机制上规避分布偏移」的方法论判断，并将性能瓶颈转移至 Rusty 类的判别上限。</w:t>
       </w:r>
     </w:p>
     <w:p>
@@ -16515,7 +16528,7 @@
           <w:b w:val="0"/>
           <w:sz w:val="24"/>
         </w:rPr>
-        <w:t>（3）将问题1 的特征体系增强至 72 维并引入 Random Forest 集成学习器，在 4 分类任务上达到 85.68% 准确率。新增的 RustRatio（锈蚀色彩占比）和 LAB a* 统计是典型的领域知识驱动特征——将「铁锈呈红褐色」的物理知识编码为可计算的数值量，展示了特征工程中领域知识与机器学习方法的有机结合。</w:t>
+        <w:t>（3）将问题1 的特征体系增强至 72 维并引入 LightGBM 梯度提升集成学习器，在 4 分类任务上达到 89.72% 准确率。新增的 RustRatio（锈蚀色彩占比）和 LAB a* 统计是典型的领域知识驱动特征——将「铁锈呈红褐色」的物理知识编码为可计算的数值量，展示了特征工程中领域知识与机器学习方法的有机结合。</w:t>
       </w:r>
     </w:p>
     <w:p>
@@ -16605,7 +16618,7 @@
           <w:b w:val="0"/>
           <w:sz w:val="24"/>
         </w:rPr>
-        <w:t>（4）Hole 类数据扩充：Hole 类仅 946 个训练样本且类内方差大，是 patch 分类的性能瓶颈（F1=0.646）。可考虑使用 CutMix、Copy-Paste 等数据增强策略，或使用生成式模型（如 Stable Diffusion Inpainting）合成更多样的 Hole 训练样本。</w:t>
+        <w:t>（4）Hole 类数据扩充：Hole 类仅 788 个训练样本且类内方差大，是 patch 分类的性能瓶颈（F1=0.724）。可考虑使用 CutMix、Copy-Paste 等数据增强策略，或使用生成式模型（如 Stable Diffusion Inpainting）合成更多样的 Hole 训练样本。</w:t>
       </w:r>
     </w:p>
     <w:p>
@@ -16799,6 +16812,26 @@
           <w:sz w:val="24"/>
         </w:rPr>
         <w:t>[15] Feng C, Zhong Y, Gao Y, et al. TOOD: Task-aligned one-stage object detection[C]. IEEE ICCV, 2021: 3490-3499.</w:t>
+      </w:r>
+    </w:p>
+    <w:p>
+      <w:r>
+        <w:rPr>
+          <w:rFonts w:ascii="宋体" w:hAnsi="宋体" w:eastAsia="宋体"/>
+          <w:b w:val="0"/>
+          <w:sz w:val="24"/>
+        </w:rPr>
+        <w:t>[16] Ke G, Meng Q, Finley T, et al. LightGBM: A highly efficient gradient boosting decision tree[C]. NeurIPS, 2017: 3146-3154.</w:t>
+      </w:r>
+    </w:p>
+    <w:p>
+      <w:r>
+        <w:rPr>
+          <w:rFonts w:ascii="宋体" w:hAnsi="宋体" w:eastAsia="宋体"/>
+          <w:b w:val="0"/>
+          <w:sz w:val="24"/>
+        </w:rPr>
+        <w:t>[17] Friedman J H. Greedy function approximation: a gradient boosting machine[J]. Annals of Statistics, 2001, 29(5): 1189-1232.</w:t>
       </w:r>
     </w:p>
     <w:p>

</xml_diff>